<commit_message>
Update BI, DL, HPC, and NLP assignments with new files
</commit_message>
<xml_diff>
--- a/BI/BI_Assignment1/BI_Assignment1.docx
+++ b/BI/BI_Assignment1/BI_Assignment1.docx
@@ -42,6 +42,7 @@
     <w:p>
       <w:pPr>
         <w:ind w:left="-5"/>
+        <w:jc w:val="both"/>
         <w:rPr>
           <w:rFonts w:ascii="Times New Roman" w:hAnsi="Times New Roman" w:cs="Times New Roman"/>
         </w:rPr>
@@ -56,21 +57,7 @@
         <w:rPr>
           <w:rFonts w:ascii="Times New Roman" w:hAnsi="Times New Roman" w:cs="Times New Roman"/>
         </w:rPr>
-        <w:t xml:space="preserve">Import the legacy data from different sources such as </w:t>
-      </w:r>
-      <w:proofErr w:type="gramStart"/>
-      <w:r>
-        <w:rPr>
-          <w:rFonts w:ascii="Times New Roman" w:hAnsi="Times New Roman" w:cs="Times New Roman"/>
-        </w:rPr>
-        <w:t>( Excel</w:t>
-      </w:r>
-      <w:proofErr w:type="gramEnd"/>
-      <w:r>
-        <w:rPr>
-          <w:rFonts w:ascii="Times New Roman" w:hAnsi="Times New Roman" w:cs="Times New Roman"/>
-        </w:rPr>
-        <w:t xml:space="preserve"> , </w:t>
+        <w:t xml:space="preserve">Import the legacy data from different sources such as ( Excel , </w:t>
       </w:r>
       <w:proofErr w:type="spellStart"/>
       <w:r>
@@ -84,21 +71,7 @@
         <w:rPr>
           <w:rFonts w:ascii="Times New Roman" w:hAnsi="Times New Roman" w:cs="Times New Roman"/>
         </w:rPr>
-        <w:t xml:space="preserve">, Oracle etc.) and load in the target system. </w:t>
-      </w:r>
-      <w:proofErr w:type="gramStart"/>
-      <w:r>
-        <w:rPr>
-          <w:rFonts w:ascii="Times New Roman" w:hAnsi="Times New Roman" w:cs="Times New Roman"/>
-        </w:rPr>
-        <w:t>( You</w:t>
-      </w:r>
-      <w:proofErr w:type="gramEnd"/>
-      <w:r>
-        <w:rPr>
-          <w:rFonts w:ascii="Times New Roman" w:hAnsi="Times New Roman" w:cs="Times New Roman"/>
-        </w:rPr>
-        <w:t xml:space="preserve"> can download sample database such as </w:t>
+        <w:t xml:space="preserve">, Oracle etc.) and load in the target system. ( You can download sample database such as </w:t>
       </w:r>
       <w:proofErr w:type="spellStart"/>
       <w:r>
@@ -1050,6 +1023,39 @@
           <w:rFonts w:ascii="Times New Roman" w:hAnsi="Times New Roman" w:cs="Times New Roman"/>
         </w:rPr>
         <w:t>The legacy data from Excel and OData (Northwind Orders table) is successfully imported and loaded into Power BI.</w:t>
+      </w:r>
+    </w:p>
+    <w:p>
+      <w:pPr>
+        <w:spacing w:after="0"/>
+        <w:ind w:left="0" w:right="796" w:firstLine="0"/>
+        <w:rPr>
+          <w:rFonts w:ascii="Times New Roman" w:hAnsi="Times New Roman" w:cs="Times New Roman"/>
+          <w:bCs/>
+        </w:rPr>
+      </w:pPr>
+      <w:r>
+        <w:rPr>
+          <w:rFonts w:ascii="Times New Roman" w:hAnsi="Times New Roman" w:cs="Times New Roman"/>
+          <w:bCs/>
+        </w:rPr>
+        <w:t xml:space="preserve">Conclusion </w:t>
+      </w:r>
+    </w:p>
+    <w:p>
+      <w:pPr>
+        <w:ind w:left="10"/>
+        <w:jc w:val="both"/>
+        <w:rPr>
+          <w:rFonts w:ascii="Times New Roman" w:hAnsi="Times New Roman" w:cs="Times New Roman"/>
+          <w:bCs/>
+        </w:rPr>
+      </w:pPr>
+      <w:r>
+        <w:rPr>
+          <w:rFonts w:ascii="Times New Roman" w:hAnsi="Times New Roman" w:cs="Times New Roman"/>
+        </w:rPr>
+        <w:t>The practical demonstrated how legacy data from heterogeneous sources such as Excel files and OData services can be integrated into Power BI. It shows that Power BI acts as a powerful data ingestion and transformation tool, forming the foundation for further data analysis and visualization in Business Intelligence workflows.</w:t>
       </w:r>
     </w:p>
     <w:sectPr>
@@ -1474,6 +1480,7 @@
   <w:style w:type="character" w:default="1" w:styleId="DefaultParagraphFont">
     <w:name w:val="Default Paragraph Font"/>
     <w:uiPriority w:val="1"/>
+    <w:semiHidden/>
     <w:unhideWhenUsed/>
   </w:style>
   <w:style w:type="table" w:default="1" w:styleId="TableNormal">

</xml_diff>